<commit_message>
Document export closer to the client's template
- Destination without the administrative tail Nominatim adds
  ('Villa Lagarina' instead of '..., Comunità della Vallagarina, Provincia
  di Trento, Trentino-Alto Adige/Südtirol, Italia'); same cleanup for
  meeting places.
- Times written like the template ('11,45', '16,15') and km with a decimal
  comma ('132,7 km').
- A meeting place that is only coordinates is left blank instead of
  printing '46.288..., 11.510...'.
- The DOCX template's base style named the font 'Helvetica, Arial', which
  is not a font, so Word fell back to a serif; it now says Arial, like the
  client's ODT (Helvetica).

Co-Authored-By: Claude Opus 5.5 (1M context) <noreply@anthropic.com>
</commit_message>
<xml_diff>
--- a/template_documents/Piano_Viaggi_TIPO.docx
+++ b/template_documents/Piano_Viaggi_TIPO.docx
@@ -4282,7 +4282,7 @@
     <w:p>
       <w:pPr>
         <w:rPr>
-          <w:rFonts w:ascii="Helvetica, Arial" w:eastAsia="Times New Roman" w:hAnsi="Helvetica, Arial" w:cs="Helvetica, Arial"/>
+          <w:rFonts w:ascii="Arial" w:eastAsia="Times New Roman" w:hAnsi="Arial" w:cs="Arial"/>
           <w:vanish/>
           <w:sz w:val="22"/>
           <w:szCs w:val="20"/>
@@ -7775,7 +7775,7 @@
       <w:widowControl/>
     </w:pPr>
     <w:rPr>
-      <w:rFonts w:ascii="Helvetica, Arial" w:eastAsia="Times New Roman" w:hAnsi="Helvetica, Arial" w:cs="Helvetica, Arial"/>
+      <w:rFonts w:ascii="Arial" w:eastAsia="Times New Roman" w:hAnsi="Arial" w:cs="Arial"/>
       <w:sz w:val="22"/>
       <w:szCs w:val="20"/>
       <w:lang w:bidi="ar-SA"/>

</xml_diff>